<commit_message>
[FIX] CFA + PDF + ZIP
</commit_message>
<xml_diff>
--- a/fuentes/CF1_220501121_CFA.docx
+++ b/fuentes/CF1_220501121_CFA.docx
@@ -4906,7 +4906,19 @@
         <w:rPr>
           <w:lang w:eastAsia="es-CO"/>
         </w:rPr>
-        <w:t>Al centralizar la información y aportar recursos integrados, la nube evita que se duplique el trabajo, así mismo</w:t>
+        <w:t>Al centralizar la información y aportar recursos integrados, la nube e</w:t>
+      </w:r>
+      <w:r>
+        <w:rPr>
+          <w:lang w:eastAsia="es-CO"/>
+        </w:rPr>
+        <w:t>vita que se duplique el trabajo;</w:t>
+      </w:r>
+      <w:r>
+        <w:rPr>
+          <w:lang w:eastAsia="es-CO"/>
+        </w:rPr>
+        <w:t xml:space="preserve"> así mismo</w:t>
       </w:r>
       <w:r>
         <w:rPr>
@@ -4932,7 +4944,21 @@
         <w:rPr>
           <w:lang w:eastAsia="es-CO"/>
         </w:rPr>
-        <w:t>La nube no solo mejora la gestión del tiempo y la comunicación, adicional</w:t>
+        <w:t>La nube no solo mejora la gesti</w:t>
+      </w:r>
+      <w:r>
+        <w:rPr>
+          <w:lang w:eastAsia="es-CO"/>
+        </w:rPr>
+        <w:t>ón del tiempo y la comunicación;</w:t>
+      </w:r>
+      <w:bookmarkStart w:id="6" w:name="_GoBack"/>
+      <w:bookmarkEnd w:id="6"/>
+      <w:r>
+        <w:rPr>
+          <w:lang w:eastAsia="es-CO"/>
+        </w:rPr>
+        <w:t xml:space="preserve"> adicional</w:t>
       </w:r>
       <w:r>
         <w:rPr>
@@ -5438,11 +5464,11 @@
           <w:numId w:val="29"/>
         </w:numPr>
       </w:pPr>
-      <w:bookmarkStart w:id="6" w:name="_Toc224026496"/>
+      <w:bookmarkStart w:id="7" w:name="_Toc224026496"/>
       <w:r>
         <w:t>Impacto en la gestión de la información</w:t>
       </w:r>
-      <w:bookmarkEnd w:id="6"/>
+      <w:bookmarkEnd w:id="7"/>
     </w:p>
     <w:p>
       <w:pPr>
@@ -6900,12 +6926,12 @@
           <w:numId w:val="29"/>
         </w:numPr>
       </w:pPr>
-      <w:bookmarkStart w:id="7" w:name="_Toc224026497"/>
+      <w:bookmarkStart w:id="8" w:name="_Toc224026497"/>
       <w:r>
         <w:lastRenderedPageBreak/>
         <w:t>Microsoft 365</w:t>
       </w:r>
-      <w:bookmarkEnd w:id="7"/>
+      <w:bookmarkEnd w:id="8"/>
     </w:p>
     <w:p>
       <w:pPr>
@@ -6966,14 +6992,14 @@
           <w:numId w:val="28"/>
         </w:numPr>
       </w:pPr>
-      <w:bookmarkStart w:id="8" w:name="_Toc222925134"/>
-      <w:bookmarkStart w:id="9" w:name="_Toc224026498"/>
-      <w:bookmarkEnd w:id="8"/>
+      <w:bookmarkStart w:id="9" w:name="_Toc222925134"/>
+      <w:bookmarkStart w:id="10" w:name="_Toc224026498"/>
+      <w:bookmarkEnd w:id="9"/>
       <w:r>
         <w:lastRenderedPageBreak/>
         <w:t>Propósito</w:t>
       </w:r>
-      <w:bookmarkEnd w:id="9"/>
+      <w:bookmarkEnd w:id="10"/>
     </w:p>
     <w:p>
       <w:pPr>
@@ -8064,12 +8090,12 @@
           <w:numId w:val="27"/>
         </w:numPr>
       </w:pPr>
-      <w:bookmarkStart w:id="10" w:name="_Toc224026499"/>
+      <w:bookmarkStart w:id="11" w:name="_Toc224026499"/>
       <w:r>
         <w:lastRenderedPageBreak/>
         <w:t>Beneficios en el almacenamiento digital</w:t>
       </w:r>
-      <w:bookmarkEnd w:id="10"/>
+      <w:bookmarkEnd w:id="11"/>
     </w:p>
     <w:p>
       <w:pPr>
@@ -8105,12 +8131,12 @@
           <w:numId w:val="26"/>
         </w:numPr>
       </w:pPr>
-      <w:bookmarkStart w:id="11" w:name="_Toc224026500"/>
+      <w:bookmarkStart w:id="12" w:name="_Toc224026500"/>
       <w:r>
         <w:lastRenderedPageBreak/>
         <w:t>Beneficios en la comunicación</w:t>
       </w:r>
-      <w:bookmarkEnd w:id="11"/>
+      <w:bookmarkEnd w:id="12"/>
     </w:p>
     <w:p>
       <w:pPr>
@@ -8196,11 +8222,11 @@
       <w:pPr>
         <w:pStyle w:val="Ttulo2"/>
       </w:pPr>
-      <w:bookmarkStart w:id="12" w:name="_Toc224026501"/>
+      <w:bookmarkStart w:id="13" w:name="_Toc224026501"/>
       <w:r>
         <w:t>Beneficios en el trabajo en equipo</w:t>
       </w:r>
-      <w:bookmarkEnd w:id="12"/>
+      <w:bookmarkEnd w:id="13"/>
     </w:p>
     <w:p>
       <w:pPr>
@@ -9668,12 +9694,12 @@
       <w:pPr>
         <w:pStyle w:val="Ttulo1"/>
       </w:pPr>
-      <w:bookmarkStart w:id="13" w:name="_Toc224026502"/>
+      <w:bookmarkStart w:id="14" w:name="_Toc224026502"/>
       <w:r>
         <w:lastRenderedPageBreak/>
         <w:t>Outlook</w:t>
       </w:r>
-      <w:bookmarkEnd w:id="13"/>
+      <w:bookmarkEnd w:id="14"/>
     </w:p>
     <w:p>
       <w:pPr>
@@ -9757,14 +9783,14 @@
           <w:lang w:eastAsia="es-CO"/>
         </w:rPr>
       </w:pPr>
-      <w:bookmarkStart w:id="14" w:name="_Toc222925141"/>
-      <w:bookmarkStart w:id="15" w:name="_Toc223940422"/>
-      <w:bookmarkStart w:id="16" w:name="_Toc223942238"/>
-      <w:bookmarkStart w:id="17" w:name="_Toc224026503"/>
-      <w:bookmarkEnd w:id="14"/>
+      <w:bookmarkStart w:id="15" w:name="_Toc222925141"/>
+      <w:bookmarkStart w:id="16" w:name="_Toc223940422"/>
+      <w:bookmarkStart w:id="17" w:name="_Toc223942238"/>
+      <w:bookmarkStart w:id="18" w:name="_Toc224026503"/>
       <w:bookmarkEnd w:id="15"/>
       <w:bookmarkEnd w:id="16"/>
       <w:bookmarkEnd w:id="17"/>
+      <w:bookmarkEnd w:id="18"/>
     </w:p>
     <w:p>
       <w:pPr>
@@ -9774,11 +9800,11 @@
           <w:numId w:val="29"/>
         </w:numPr>
       </w:pPr>
-      <w:bookmarkStart w:id="18" w:name="_Toc224026504"/>
+      <w:bookmarkStart w:id="19" w:name="_Toc224026504"/>
       <w:r>
         <w:t>Funciones del correo electrónico</w:t>
       </w:r>
-      <w:bookmarkEnd w:id="18"/>
+      <w:bookmarkEnd w:id="19"/>
     </w:p>
     <w:p>
       <w:pPr>
@@ -10566,12 +10592,12 @@
           <w:numId w:val="29"/>
         </w:numPr>
       </w:pPr>
-      <w:bookmarkStart w:id="19" w:name="_Toc224026505"/>
+      <w:bookmarkStart w:id="20" w:name="_Toc224026505"/>
       <w:r>
         <w:lastRenderedPageBreak/>
         <w:t>Calendario</w:t>
       </w:r>
-      <w:bookmarkEnd w:id="19"/>
+      <w:bookmarkEnd w:id="20"/>
     </w:p>
     <w:p>
       <w:pPr>
@@ -10620,11 +10646,11 @@
           <w:numId w:val="29"/>
         </w:numPr>
       </w:pPr>
-      <w:bookmarkStart w:id="20" w:name="_Toc224026506"/>
+      <w:bookmarkStart w:id="21" w:name="_Toc224026506"/>
       <w:r>
         <w:t>Funciones del calendario</w:t>
       </w:r>
-      <w:bookmarkEnd w:id="20"/>
+      <w:bookmarkEnd w:id="21"/>
       <w:r>
         <w:tab/>
       </w:r>
@@ -10878,12 +10904,12 @@
           <w:numId w:val="29"/>
         </w:numPr>
       </w:pPr>
-      <w:bookmarkStart w:id="21" w:name="_Toc224026507"/>
+      <w:bookmarkStart w:id="22" w:name="_Toc224026507"/>
       <w:r>
         <w:lastRenderedPageBreak/>
         <w:t>Programación de reuniones y eventos</w:t>
       </w:r>
-      <w:bookmarkEnd w:id="21"/>
+      <w:bookmarkEnd w:id="22"/>
       <w:r>
         <w:tab/>
       </w:r>
@@ -11789,12 +11815,12 @@
       <w:pPr>
         <w:pStyle w:val="Ttulo1"/>
       </w:pPr>
-      <w:bookmarkStart w:id="22" w:name="_Toc224026508"/>
+      <w:bookmarkStart w:id="23" w:name="_Toc224026508"/>
       <w:r>
         <w:lastRenderedPageBreak/>
         <w:t>OneDrive</w:t>
       </w:r>
-      <w:bookmarkEnd w:id="22"/>
+      <w:bookmarkEnd w:id="23"/>
     </w:p>
     <w:p>
       <w:pPr>
@@ -11856,13 +11882,13 @@
           <w:numId w:val="33"/>
         </w:numPr>
       </w:pPr>
-      <w:bookmarkStart w:id="23" w:name="_Toc222925147"/>
-      <w:bookmarkStart w:id="24" w:name="_Toc224026509"/>
-      <w:bookmarkEnd w:id="23"/>
+      <w:bookmarkStart w:id="24" w:name="_Toc222925147"/>
+      <w:bookmarkStart w:id="25" w:name="_Toc224026509"/>
+      <w:bookmarkEnd w:id="24"/>
       <w:r>
         <w:t>Características principales</w:t>
       </w:r>
-      <w:bookmarkEnd w:id="24"/>
+      <w:bookmarkEnd w:id="25"/>
     </w:p>
     <w:p>
       <w:pPr>
@@ -12452,12 +12478,12 @@
           <w:numId w:val="31"/>
         </w:numPr>
       </w:pPr>
-      <w:bookmarkStart w:id="25" w:name="_Toc224026510"/>
+      <w:bookmarkStart w:id="26" w:name="_Toc224026510"/>
       <w:r>
         <w:lastRenderedPageBreak/>
         <w:t>Beneficios del almacenamiento personal en la nube</w:t>
       </w:r>
-      <w:bookmarkEnd w:id="25"/>
+      <w:bookmarkEnd w:id="26"/>
     </w:p>
     <w:p>
       <w:pPr>
@@ -12695,11 +12721,11 @@
           <w:numId w:val="32"/>
         </w:numPr>
       </w:pPr>
-      <w:bookmarkStart w:id="26" w:name="_Toc224026511"/>
+      <w:bookmarkStart w:id="27" w:name="_Toc224026511"/>
       <w:r>
         <w:t>Gestión de archivos</w:t>
       </w:r>
-      <w:bookmarkEnd w:id="26"/>
+      <w:bookmarkEnd w:id="27"/>
     </w:p>
     <w:p>
       <w:pPr>
@@ -12914,12 +12940,12 @@
       <w:pPr>
         <w:pStyle w:val="Titulosgenerales"/>
       </w:pPr>
-      <w:bookmarkStart w:id="27" w:name="_Toc224026512"/>
+      <w:bookmarkStart w:id="28" w:name="_Toc224026512"/>
       <w:r>
         <w:lastRenderedPageBreak/>
         <w:t>Síntesis</w:t>
       </w:r>
-      <w:bookmarkEnd w:id="27"/>
+      <w:bookmarkEnd w:id="28"/>
     </w:p>
     <w:p>
       <w:pPr>
@@ -13243,14 +13269,14 @@
       <w:pPr>
         <w:pStyle w:val="Titulosgenerales"/>
       </w:pPr>
-      <w:bookmarkStart w:id="28" w:name="_Toc176443725"/>
-      <w:bookmarkStart w:id="29" w:name="_Toc224026513"/>
+      <w:bookmarkStart w:id="29" w:name="_Toc176443725"/>
+      <w:bookmarkStart w:id="30" w:name="_Toc224026513"/>
       <w:r>
         <w:lastRenderedPageBreak/>
         <w:t>Glosario</w:t>
       </w:r>
-      <w:bookmarkEnd w:id="28"/>
       <w:bookmarkEnd w:id="29"/>
+      <w:bookmarkEnd w:id="30"/>
     </w:p>
     <w:p>
       <w:pPr>
@@ -13680,8 +13706,8 @@
           <w:lang w:val="es-MX"/>
         </w:rPr>
       </w:pPr>
-      <w:bookmarkStart w:id="30" w:name="_Toc176443726"/>
-      <w:bookmarkStart w:id="31" w:name="_Toc224026514"/>
+      <w:bookmarkStart w:id="31" w:name="_Toc176443726"/>
+      <w:bookmarkStart w:id="32" w:name="_Toc224026514"/>
       <w:r>
         <w:rPr>
           <w:lang w:val="es-MX"/>
@@ -13689,8 +13715,8 @@
         <w:lastRenderedPageBreak/>
         <w:t>Referencias bibliográficas</w:t>
       </w:r>
-      <w:bookmarkEnd w:id="30"/>
       <w:bookmarkEnd w:id="31"/>
+      <w:bookmarkEnd w:id="32"/>
     </w:p>
     <w:p>
       <w:pPr>
@@ -13839,8 +13865,6 @@
         </w:rPr>
         <w:t>ómo Bitrix24 puede acelerar la transformación de tu empresa?</w:t>
       </w:r>
-      <w:bookmarkStart w:id="32" w:name="_GoBack"/>
-      <w:bookmarkEnd w:id="32"/>
     </w:p>
     <w:p>
       <w:pPr>
@@ -14838,7 +14862,7 @@
         <w:noProof/>
         <w:lang w:val="es-ES"/>
       </w:rPr>
-      <w:t>49</w:t>
+      <w:t>23</w:t>
     </w:r>
     <w:r>
       <w:fldChar w:fldCharType="end"/>
@@ -18387,6 +18411,7 @@
   <w:style w:type="character" w:default="1" w:styleId="Fuentedeprrafopredeter">
     <w:name w:val="Default Paragraph Font"/>
     <w:uiPriority w:val="1"/>
+    <w:semiHidden/>
     <w:unhideWhenUsed/>
   </w:style>
   <w:style w:type="table" w:default="1" w:styleId="Tablanormal">
@@ -19740,11 +19765,11 @@
 </file>
 
 <file path=customXml/itemProps3.xml><?xml version="1.0" encoding="utf-8"?>
-<ds:datastoreItem xmlns:ds="http://schemas.openxmlformats.org/officeDocument/2006/customXml" ds:itemID="{96DFB569-98CC-4B76-9F9E-B31B6F44ECB7}"/>
+<ds:datastoreItem xmlns:ds="http://schemas.openxmlformats.org/officeDocument/2006/customXml" ds:itemID="{26990147-4413-4F50-A7ED-1A0BE2DEB69B}"/>
 </file>
 
 <file path=customXml/itemProps4.xml><?xml version="1.0" encoding="utf-8"?>
-<ds:datastoreItem xmlns:ds="http://schemas.openxmlformats.org/officeDocument/2006/customXml" ds:itemID="{EC35982A-AD8E-4246-A132-5CD93B87A9E7}">
+<ds:datastoreItem xmlns:ds="http://schemas.openxmlformats.org/officeDocument/2006/customXml" ds:itemID="{F52DF593-E19D-49AE-BB0B-193557A522FF}">
   <ds:schemaRefs>
     <ds:schemaRef ds:uri="http://schemas.openxmlformats.org/officeDocument/2006/bibliography"/>
   </ds:schemaRefs>

</xml_diff>

<commit_message>
[FIX] Validacion REPO v1.2
</commit_message>
<xml_diff>
--- a/fuentes/CF1_220501121_CFA.docx
+++ b/fuentes/CF1_220501121_CFA.docx
@@ -474,7 +474,7 @@
           <w:color w:val="000000"/>
           <w:kern w:val="0"/>
         </w:rPr>
-        <w:t>5</w:t>
+        <w:t>6</w:t>
       </w:r>
       <w:r>
         <w:br w:type="page"/>
@@ -3251,6 +3251,7 @@
     <w:p>
       <w:pPr>
         <w:ind w:firstLine="0"/>
+        <w:jc w:val="center"/>
         <w:rPr>
           <w:b/>
         </w:rPr>
@@ -4952,8 +4953,6 @@
         </w:rPr>
         <w:t>ón del tiempo y la comunicación;</w:t>
       </w:r>
-      <w:bookmarkStart w:id="6" w:name="_GoBack"/>
-      <w:bookmarkEnd w:id="6"/>
       <w:r>
         <w:rPr>
           <w:lang w:eastAsia="es-CO"/>
@@ -5464,11 +5463,11 @@
           <w:numId w:val="29"/>
         </w:numPr>
       </w:pPr>
-      <w:bookmarkStart w:id="7" w:name="_Toc224026496"/>
+      <w:bookmarkStart w:id="6" w:name="_Toc224026496"/>
       <w:r>
         <w:t>Impacto en la gestión de la información</w:t>
       </w:r>
-      <w:bookmarkEnd w:id="7"/>
+      <w:bookmarkEnd w:id="6"/>
     </w:p>
     <w:p>
       <w:pPr>
@@ -6926,12 +6925,12 @@
           <w:numId w:val="29"/>
         </w:numPr>
       </w:pPr>
-      <w:bookmarkStart w:id="8" w:name="_Toc224026497"/>
+      <w:bookmarkStart w:id="7" w:name="_Toc224026497"/>
       <w:r>
         <w:lastRenderedPageBreak/>
         <w:t>Microsoft 365</w:t>
       </w:r>
-      <w:bookmarkEnd w:id="8"/>
+      <w:bookmarkEnd w:id="7"/>
     </w:p>
     <w:p>
       <w:pPr>
@@ -6992,14 +6991,14 @@
           <w:numId w:val="28"/>
         </w:numPr>
       </w:pPr>
-      <w:bookmarkStart w:id="9" w:name="_Toc222925134"/>
-      <w:bookmarkStart w:id="10" w:name="_Toc224026498"/>
-      <w:bookmarkEnd w:id="9"/>
+      <w:bookmarkStart w:id="8" w:name="_Toc222925134"/>
+      <w:bookmarkStart w:id="9" w:name="_Toc224026498"/>
+      <w:bookmarkEnd w:id="8"/>
       <w:r>
         <w:lastRenderedPageBreak/>
         <w:t>Propósito</w:t>
       </w:r>
-      <w:bookmarkEnd w:id="10"/>
+      <w:bookmarkEnd w:id="9"/>
     </w:p>
     <w:p>
       <w:pPr>
@@ -8090,12 +8089,12 @@
           <w:numId w:val="27"/>
         </w:numPr>
       </w:pPr>
-      <w:bookmarkStart w:id="11" w:name="_Toc224026499"/>
+      <w:bookmarkStart w:id="10" w:name="_Toc224026499"/>
       <w:r>
         <w:lastRenderedPageBreak/>
         <w:t>Beneficios en el almacenamiento digital</w:t>
       </w:r>
-      <w:bookmarkEnd w:id="11"/>
+      <w:bookmarkEnd w:id="10"/>
     </w:p>
     <w:p>
       <w:pPr>
@@ -8131,12 +8130,12 @@
           <w:numId w:val="26"/>
         </w:numPr>
       </w:pPr>
-      <w:bookmarkStart w:id="12" w:name="_Toc224026500"/>
+      <w:bookmarkStart w:id="11" w:name="_Toc224026500"/>
       <w:r>
         <w:lastRenderedPageBreak/>
         <w:t>Beneficios en la comunicación</w:t>
       </w:r>
-      <w:bookmarkEnd w:id="12"/>
+      <w:bookmarkEnd w:id="11"/>
     </w:p>
     <w:p>
       <w:pPr>
@@ -8222,11 +8221,11 @@
       <w:pPr>
         <w:pStyle w:val="Ttulo2"/>
       </w:pPr>
-      <w:bookmarkStart w:id="13" w:name="_Toc224026501"/>
+      <w:bookmarkStart w:id="12" w:name="_Toc224026501"/>
       <w:r>
         <w:t>Beneficios en el trabajo en equipo</w:t>
       </w:r>
-      <w:bookmarkEnd w:id="13"/>
+      <w:bookmarkEnd w:id="12"/>
     </w:p>
     <w:p>
       <w:pPr>
@@ -9694,12 +9693,12 @@
       <w:pPr>
         <w:pStyle w:val="Ttulo1"/>
       </w:pPr>
-      <w:bookmarkStart w:id="14" w:name="_Toc224026502"/>
+      <w:bookmarkStart w:id="13" w:name="_Toc224026502"/>
       <w:r>
         <w:lastRenderedPageBreak/>
         <w:t>Outlook</w:t>
       </w:r>
-      <w:bookmarkEnd w:id="14"/>
+      <w:bookmarkEnd w:id="13"/>
     </w:p>
     <w:p>
       <w:pPr>
@@ -9783,14 +9782,14 @@
           <w:lang w:eastAsia="es-CO"/>
         </w:rPr>
       </w:pPr>
-      <w:bookmarkStart w:id="15" w:name="_Toc222925141"/>
-      <w:bookmarkStart w:id="16" w:name="_Toc223940422"/>
-      <w:bookmarkStart w:id="17" w:name="_Toc223942238"/>
-      <w:bookmarkStart w:id="18" w:name="_Toc224026503"/>
+      <w:bookmarkStart w:id="14" w:name="_Toc222925141"/>
+      <w:bookmarkStart w:id="15" w:name="_Toc223940422"/>
+      <w:bookmarkStart w:id="16" w:name="_Toc223942238"/>
+      <w:bookmarkStart w:id="17" w:name="_Toc224026503"/>
+      <w:bookmarkEnd w:id="14"/>
       <w:bookmarkEnd w:id="15"/>
       <w:bookmarkEnd w:id="16"/>
       <w:bookmarkEnd w:id="17"/>
-      <w:bookmarkEnd w:id="18"/>
     </w:p>
     <w:p>
       <w:pPr>
@@ -9800,11 +9799,11 @@
           <w:numId w:val="29"/>
         </w:numPr>
       </w:pPr>
-      <w:bookmarkStart w:id="19" w:name="_Toc224026504"/>
+      <w:bookmarkStart w:id="18" w:name="_Toc224026504"/>
       <w:r>
         <w:t>Funciones del correo electrónico</w:t>
       </w:r>
-      <w:bookmarkEnd w:id="19"/>
+      <w:bookmarkEnd w:id="18"/>
     </w:p>
     <w:p>
       <w:pPr>
@@ -10137,7 +10136,6 @@
           <w:ilvl w:val="0"/>
           <w:numId w:val="0"/>
         </w:numPr>
-        <w:jc w:val="left"/>
         <w:rPr>
           <w:rStyle w:val="Hipervnculo"/>
         </w:rPr>
@@ -10381,6 +10379,7 @@
       <w:pPr>
         <w:spacing w:before="0" w:after="0"/>
         <w:ind w:firstLine="0"/>
+        <w:jc w:val="center"/>
         <w:rPr>
           <w:rStyle w:val="Hipervnculo"/>
         </w:rPr>
@@ -10592,12 +10591,12 @@
           <w:numId w:val="29"/>
         </w:numPr>
       </w:pPr>
-      <w:bookmarkStart w:id="20" w:name="_Toc224026505"/>
+      <w:bookmarkStart w:id="19" w:name="_Toc224026505"/>
       <w:r>
         <w:lastRenderedPageBreak/>
         <w:t>Calendario</w:t>
       </w:r>
-      <w:bookmarkEnd w:id="20"/>
+      <w:bookmarkEnd w:id="19"/>
     </w:p>
     <w:p>
       <w:pPr>
@@ -10646,11 +10645,11 @@
           <w:numId w:val="29"/>
         </w:numPr>
       </w:pPr>
-      <w:bookmarkStart w:id="21" w:name="_Toc224026506"/>
+      <w:bookmarkStart w:id="20" w:name="_Toc224026506"/>
       <w:r>
         <w:t>Funciones del calendario</w:t>
       </w:r>
-      <w:bookmarkEnd w:id="21"/>
+      <w:bookmarkEnd w:id="20"/>
       <w:r>
         <w:tab/>
       </w:r>
@@ -10904,12 +10903,12 @@
           <w:numId w:val="29"/>
         </w:numPr>
       </w:pPr>
-      <w:bookmarkStart w:id="22" w:name="_Toc224026507"/>
+      <w:bookmarkStart w:id="21" w:name="_Toc224026507"/>
       <w:r>
         <w:lastRenderedPageBreak/>
         <w:t>Programación de reuniones y eventos</w:t>
       </w:r>
-      <w:bookmarkEnd w:id="22"/>
+      <w:bookmarkEnd w:id="21"/>
       <w:r>
         <w:tab/>
       </w:r>
@@ -11195,6 +11194,7 @@
     <w:p>
       <w:pPr>
         <w:ind w:firstLine="0"/>
+        <w:jc w:val="center"/>
         <w:rPr>
           <w:rStyle w:val="Hipervnculo"/>
           <w:lang w:eastAsia="es-CO"/>
@@ -11815,12 +11815,12 @@
       <w:pPr>
         <w:pStyle w:val="Ttulo1"/>
       </w:pPr>
-      <w:bookmarkStart w:id="23" w:name="_Toc224026508"/>
+      <w:bookmarkStart w:id="22" w:name="_Toc224026508"/>
       <w:r>
         <w:lastRenderedPageBreak/>
         <w:t>OneDrive</w:t>
       </w:r>
-      <w:bookmarkEnd w:id="23"/>
+      <w:bookmarkEnd w:id="22"/>
     </w:p>
     <w:p>
       <w:pPr>
@@ -11882,13 +11882,13 @@
           <w:numId w:val="33"/>
         </w:numPr>
       </w:pPr>
-      <w:bookmarkStart w:id="24" w:name="_Toc222925147"/>
-      <w:bookmarkStart w:id="25" w:name="_Toc224026509"/>
+      <w:bookmarkStart w:id="23" w:name="_Toc222925147"/>
+      <w:bookmarkStart w:id="24" w:name="_Toc224026509"/>
+      <w:bookmarkEnd w:id="23"/>
+      <w:r>
+        <w:t>Características principales</w:t>
+      </w:r>
       <w:bookmarkEnd w:id="24"/>
-      <w:r>
-        <w:t>Características principales</w:t>
-      </w:r>
-      <w:bookmarkEnd w:id="25"/>
     </w:p>
     <w:p>
       <w:pPr>
@@ -12478,12 +12478,12 @@
           <w:numId w:val="31"/>
         </w:numPr>
       </w:pPr>
-      <w:bookmarkStart w:id="26" w:name="_Toc224026510"/>
+      <w:bookmarkStart w:id="25" w:name="_Toc224026510"/>
       <w:r>
         <w:lastRenderedPageBreak/>
         <w:t>Beneficios del almacenamiento personal en la nube</w:t>
       </w:r>
-      <w:bookmarkEnd w:id="26"/>
+      <w:bookmarkEnd w:id="25"/>
     </w:p>
     <w:p>
       <w:pPr>
@@ -12721,11 +12721,11 @@
           <w:numId w:val="32"/>
         </w:numPr>
       </w:pPr>
-      <w:bookmarkStart w:id="27" w:name="_Toc224026511"/>
+      <w:bookmarkStart w:id="26" w:name="_Toc224026511"/>
       <w:r>
         <w:t>Gestión de archivos</w:t>
       </w:r>
-      <w:bookmarkEnd w:id="27"/>
+      <w:bookmarkEnd w:id="26"/>
     </w:p>
     <w:p>
       <w:pPr>
@@ -12940,12 +12940,12 @@
       <w:pPr>
         <w:pStyle w:val="Titulosgenerales"/>
       </w:pPr>
-      <w:bookmarkStart w:id="28" w:name="_Toc224026512"/>
+      <w:bookmarkStart w:id="27" w:name="_Toc224026512"/>
       <w:r>
         <w:lastRenderedPageBreak/>
         <w:t>Síntesis</w:t>
       </w:r>
-      <w:bookmarkEnd w:id="28"/>
+      <w:bookmarkEnd w:id="27"/>
     </w:p>
     <w:p>
       <w:pPr>
@@ -13269,14 +13269,14 @@
       <w:pPr>
         <w:pStyle w:val="Titulosgenerales"/>
       </w:pPr>
-      <w:bookmarkStart w:id="29" w:name="_Toc176443725"/>
-      <w:bookmarkStart w:id="30" w:name="_Toc224026513"/>
+      <w:bookmarkStart w:id="28" w:name="_Toc176443725"/>
+      <w:bookmarkStart w:id="29" w:name="_Toc224026513"/>
       <w:r>
         <w:lastRenderedPageBreak/>
         <w:t>Glosario</w:t>
       </w:r>
+      <w:bookmarkEnd w:id="28"/>
       <w:bookmarkEnd w:id="29"/>
-      <w:bookmarkEnd w:id="30"/>
     </w:p>
     <w:p>
       <w:pPr>
@@ -13706,8 +13706,8 @@
           <w:lang w:val="es-MX"/>
         </w:rPr>
       </w:pPr>
-      <w:bookmarkStart w:id="31" w:name="_Toc176443726"/>
-      <w:bookmarkStart w:id="32" w:name="_Toc224026514"/>
+      <w:bookmarkStart w:id="30" w:name="_Toc176443726"/>
+      <w:bookmarkStart w:id="31" w:name="_Toc224026514"/>
       <w:r>
         <w:rPr>
           <w:lang w:val="es-MX"/>
@@ -13715,8 +13715,8 @@
         <w:lastRenderedPageBreak/>
         <w:t>Referencias bibliográficas</w:t>
       </w:r>
+      <w:bookmarkEnd w:id="30"/>
       <w:bookmarkEnd w:id="31"/>
-      <w:bookmarkEnd w:id="32"/>
     </w:p>
     <w:p>
       <w:pPr>
@@ -13952,14 +13952,14 @@
       <w:pPr>
         <w:pStyle w:val="Titulosgenerales"/>
       </w:pPr>
-      <w:bookmarkStart w:id="33" w:name="_Toc176443727"/>
-      <w:bookmarkStart w:id="34" w:name="_Toc224026515"/>
+      <w:bookmarkStart w:id="32" w:name="_Toc176443727"/>
+      <w:bookmarkStart w:id="33" w:name="_Toc224026515"/>
       <w:r>
         <w:lastRenderedPageBreak/>
         <w:t>Créditos</w:t>
       </w:r>
+      <w:bookmarkEnd w:id="32"/>
       <w:bookmarkEnd w:id="33"/>
-      <w:bookmarkEnd w:id="34"/>
     </w:p>
     <w:tbl>
       <w:tblPr>
@@ -14091,7 +14091,7 @@
               </w:rPr>
             </w:pPr>
             <w:r>
-              <w:t>Responsable del ecosistema</w:t>
+              <w:t>Responsable Ecosistema de Recursos Educativos Digitales (RED)</w:t>
             </w:r>
           </w:p>
         </w:tc>
@@ -14111,8 +14111,18 @@
               </w:rPr>
             </w:pPr>
             <w:r>
-              <w:t>Dirección General</w:t>
-            </w:r>
+              <w:t xml:space="preserve">Centro </w:t>
+            </w:r>
+            <w:proofErr w:type="spellStart"/>
+            <w:r>
+              <w:t>Agroturístico</w:t>
+            </w:r>
+            <w:proofErr w:type="spellEnd"/>
+            <w:r>
+              <w:t xml:space="preserve"> - Regional Santander</w:t>
+            </w:r>
+            <w:bookmarkStart w:id="34" w:name="_GoBack"/>
+            <w:bookmarkEnd w:id="34"/>
           </w:p>
         </w:tc>
       </w:tr>
@@ -14554,6 +14564,7 @@
               </w:rPr>
             </w:pPr>
             <w:r>
+              <w:lastRenderedPageBreak/>
               <w:t>Erika Daniela Manrique Rueda</w:t>
             </w:r>
           </w:p>
@@ -14622,7 +14633,6 @@
               </w:rPr>
             </w:pPr>
             <w:r>
-              <w:lastRenderedPageBreak/>
               <w:t>Laura Paola Gelvez Manosalva</w:t>
             </w:r>
           </w:p>
@@ -14862,7 +14872,7 @@
         <w:noProof/>
         <w:lang w:val="es-ES"/>
       </w:rPr>
-      <w:t>23</w:t>
+      <w:t>49</w:t>
     </w:r>
     <w:r>
       <w:fldChar w:fldCharType="end"/>
@@ -19527,17 +19537,6 @@
 </file>
 
 <file path=customXml/item1.xml><?xml version="1.0" encoding="utf-8"?>
-<p:properties xmlns:p="http://schemas.microsoft.com/office/2006/metadata/properties" xmlns:xsi="http://www.w3.org/2001/XMLSchema-instance" xmlns:pc="http://schemas.microsoft.com/office/infopath/2007/PartnerControls">
-  <documentManagement>
-    <TaxCatchAll xmlns="285d351f-f218-493a-825f-85a9dfbde315" xsi:nil="true"/>
-    <lcf76f155ced4ddcb4097134ff3c332f xmlns="55abea07-cd72-4a95-add0-1082a24cf9e9">
-      <Terms xmlns="http://schemas.microsoft.com/office/infopath/2007/PartnerControls"/>
-    </lcf76f155ced4ddcb4097134ff3c332f>
-  </documentManagement>
-</p:properties>
-</file>
-
-<file path=customXml/item2.xml><?xml version="1.0" encoding="utf-8"?>
 <?mso-contentType ?>
 <FormTemplates xmlns="http://schemas.microsoft.com/sharepoint/v3/contenttype/forms">
   <Display>DocumentLibraryForm</Display>
@@ -19546,7 +19545,7 @@
 </FormTemplates>
 </file>
 
-<file path=customXml/item3.xml><?xml version="1.0" encoding="utf-8"?>
+<file path=customXml/item2.xml><?xml version="1.0" encoding="utf-8"?>
 <ct:contentTypeSchema xmlns:ct="http://schemas.microsoft.com/office/2006/metadata/contentType" xmlns:ma="http://schemas.microsoft.com/office/2006/metadata/properties/metaAttributes" ct:_="" ma:_="" ma:contentTypeName="Documento" ma:contentTypeID="0x0101005D7421CBAB376F47AC1876466873BE0C" ma:contentTypeVersion="11" ma:contentTypeDescription="Crear nuevo documento." ma:contentTypeScope="" ma:versionID="f360f8b6fb6f4c8bd21c6a7e407e2e16">
   <xsd:schema xmlns:xsd="http://www.w3.org/2001/XMLSchema" xmlns:xs="http://www.w3.org/2001/XMLSchema" xmlns:p="http://schemas.microsoft.com/office/2006/metadata/properties" xmlns:ns2="55abea07-cd72-4a95-add0-1082a24cf9e9" xmlns:ns3="285d351f-f218-493a-825f-85a9dfbde315" targetNamespace="http://schemas.microsoft.com/office/2006/metadata/properties" ma:root="true" ma:fieldsID="45e32b76c8e436055369618aac27ad35" ns2:_="" ns3:_="">
     <xsd:import namespace="55abea07-cd72-4a95-add0-1082a24cf9e9"/>
@@ -19741,11 +19740,34 @@
 </ct:contentTypeSchema>
 </file>
 
+<file path=customXml/item3.xml><?xml version="1.0" encoding="utf-8"?>
+<p:properties xmlns:p="http://schemas.microsoft.com/office/2006/metadata/properties" xmlns:xsi="http://www.w3.org/2001/XMLSchema-instance" xmlns:pc="http://schemas.microsoft.com/office/infopath/2007/PartnerControls">
+  <documentManagement>
+    <TaxCatchAll xmlns="285d351f-f218-493a-825f-85a9dfbde315" xsi:nil="true"/>
+    <lcf76f155ced4ddcb4097134ff3c332f xmlns="55abea07-cd72-4a95-add0-1082a24cf9e9">
+      <Terms xmlns="http://schemas.microsoft.com/office/infopath/2007/PartnerControls"/>
+    </lcf76f155ced4ddcb4097134ff3c332f>
+  </documentManagement>
+</p:properties>
+</file>
+
 <file path=customXml/item4.xml><?xml version="1.0" encoding="utf-8"?>
 <b:Sources xmlns:b="http://schemas.openxmlformats.org/officeDocument/2006/bibliography" xmlns="http://schemas.openxmlformats.org/officeDocument/2006/bibliography" SelectedStyle="\APASixthEditionOfficeOnline.xsl" StyleName="APA" Version="6"/>
 </file>
 
 <file path=customXml/itemProps1.xml><?xml version="1.0" encoding="utf-8"?>
+<ds:datastoreItem xmlns:ds="http://schemas.openxmlformats.org/officeDocument/2006/customXml" ds:itemID="{91756AAB-0645-4FFC-990B-34BB6096B23B}">
+  <ds:schemaRefs>
+    <ds:schemaRef ds:uri="http://schemas.microsoft.com/sharepoint/v3/contenttype/forms"/>
+  </ds:schemaRefs>
+</ds:datastoreItem>
+</file>
+
+<file path=customXml/itemProps2.xml><?xml version="1.0" encoding="utf-8"?>
+<ds:datastoreItem xmlns:ds="http://schemas.openxmlformats.org/officeDocument/2006/customXml" ds:itemID="{B4229767-A269-4C63-BCC6-32BE4773702E}"/>
+</file>
+
+<file path=customXml/itemProps3.xml><?xml version="1.0" encoding="utf-8"?>
 <ds:datastoreItem xmlns:ds="http://schemas.openxmlformats.org/officeDocument/2006/customXml" ds:itemID="{CEECB56F-E1D8-45BF-A0A3-B5258E7263D4}">
   <ds:schemaRefs>
     <ds:schemaRef ds:uri="http://schemas.microsoft.com/office/2006/metadata/properties"/>
@@ -19756,20 +19778,8 @@
 </ds:datastoreItem>
 </file>
 
-<file path=customXml/itemProps2.xml><?xml version="1.0" encoding="utf-8"?>
-<ds:datastoreItem xmlns:ds="http://schemas.openxmlformats.org/officeDocument/2006/customXml" ds:itemID="{91756AAB-0645-4FFC-990B-34BB6096B23B}">
-  <ds:schemaRefs>
-    <ds:schemaRef ds:uri="http://schemas.microsoft.com/sharepoint/v3/contenttype/forms"/>
-  </ds:schemaRefs>
-</ds:datastoreItem>
-</file>
-
-<file path=customXml/itemProps3.xml><?xml version="1.0" encoding="utf-8"?>
-<ds:datastoreItem xmlns:ds="http://schemas.openxmlformats.org/officeDocument/2006/customXml" ds:itemID="{26990147-4413-4F50-A7ED-1A0BE2DEB69B}"/>
-</file>
-
 <file path=customXml/itemProps4.xml><?xml version="1.0" encoding="utf-8"?>
-<ds:datastoreItem xmlns:ds="http://schemas.openxmlformats.org/officeDocument/2006/customXml" ds:itemID="{F52DF593-E19D-49AE-BB0B-193557A522FF}">
+<ds:datastoreItem xmlns:ds="http://schemas.openxmlformats.org/officeDocument/2006/customXml" ds:itemID="{EDA4CC20-A573-4074-98B9-83E41FD585D2}">
   <ds:schemaRefs>
     <ds:schemaRef ds:uri="http://schemas.openxmlformats.org/officeDocument/2006/bibliography"/>
   </ds:schemaRefs>

</xml_diff>